<commit_message>
Release DXL 0.5 with NR compatibility and stability fixes
</commit_message>
<xml_diff>
--- a/docs/DXL-Guide-EN.docx
+++ b/docs/DXL-Guide-EN.docx
@@ -15,7 +15,7 @@
         <w:pStyle w:val="Subtitle"/>
       </w:pPr>
       <w:r>
-        <w:t>Version 0.1  By LCPD15</w:t>
+        <w:t>Version 0.5  By LCPD15</w:t>
       </w:r>
     </w:p>
     <w:p>
@@ -954,7 +954,7 @@
       <w:rPr>
         <w:sz w:val="16"/>
       </w:rPr>
-      <w:t xml:space="preserve">DXL 0.1  |  </w:t>
+      <w:t xml:space="preserve">DXL 0.5  |  </w:t>
     </w:r>
     <w:fldSimple w:instr="PAGE"/>
   </w:p>

</xml_diff>

<commit_message>
Release DXL 0.6 with per-game color grading and Custom FX
</commit_message>
<xml_diff>
--- a/docs/DXL-Guide-EN.docx
+++ b/docs/DXL-Guide-EN.docx
@@ -15,7 +15,7 @@
         <w:pStyle w:val="Subtitle"/>
       </w:pPr>
       <w:r>
-        <w:t>Version 0.5  By LCPD15</w:t>
+        <w:t>Version 0.6  By LCPD15</w:t>
       </w:r>
     </w:p>
     <w:p>
@@ -182,7 +182,7 @@
     </w:p>
     <w:p>
       <w:r>
-        <w:t>Del: toggle NR. End: toggle the panel. Alt + F8: try loading into the current game window. Esc or the panel’s × closes the panel. Change bindings in Global settings.</w:t>
+        <w:t>Del: toggle effects. End: toggle the panel. Alt + F8: try loading into the current game window. Esc or the panel’s × closes the panel. Change bindings in Global settings.</w:t>
       </w:r>
     </w:p>
     <w:p>
@@ -932,6 +932,113 @@
         <w:t>Strength ranges from 0 to 1. Mask feather defaults to 8 to soften edges. Recognition may be poor, especially for anime scenes, occlusion or small objects. Turn it off if it misidentifies objects or produces unnatural edges.</w:t>
       </w:r>
     </w:p>
+    <w:p>
+      <w:r>
+        <w:br w:type="page"/>
+      </w:r>
+    </w:p>
+    <w:p>
+      <w:pPr>
+        <w:pStyle w:val="Heading1"/>
+      </w:pPr>
+      <w:r>
+        <w:rPr>
+          <w:color w:val="000000"/>
+        </w:rPr>
+        <w:t>Color grading and filters</w:t>
+      </w:r>
+    </w:p>
+    <w:p>
+      <w:pPr>
+        <w:spacing w:after="140"/>
+      </w:pPr>
+      <w:r>
+        <w:t>Press End and select Color Grading beside DLSSNR. Switches sit beside the values. Reset changes only the value, keeping the switch state. Settings are saved per game; disabled effects skip processing.</w:t>
+      </w:r>
+    </w:p>
+    <w:p>
+      <w:pPr>
+        <w:pStyle w:val="Heading2"/>
+      </w:pPr>
+      <w:r>
+        <w:rPr>
+          <w:color w:val="000000"/>
+        </w:rPr>
+        <w:t>Basic adjustments</w:t>
+      </w:r>
+    </w:p>
+    <w:p>
+      <w:pPr>
+        <w:spacing w:after="140"/>
+      </w:pPr>
+      <w:r>
+        <w:t>Exposure, contrast, saturation, temperature, tint, shadows, midtones and highlights adjust the game image. On the native SR route they usually run before game UI; later game exposure or tone mapping may affect them.</w:t>
+      </w:r>
+    </w:p>
+    <w:p>
+      <w:pPr>
+        <w:pStyle w:val="Heading2"/>
+      </w:pPr>
+      <w:r>
+        <w:rPr>
+          <w:color w:val="000000"/>
+        </w:rPr>
+        <w:t>Final-image post-processing</w:t>
+      </w:r>
+    </w:p>
+    <w:p>
+      <w:pPr>
+        <w:spacing w:after="140"/>
+      </w:pPr>
+      <w:r>
+        <w:t>LUTs, sharpening, bloom, vignette, film grain, monochrome and custom effects now process the final image, including game UI. They work independently of NR and its menu pauses when a safe presentation route is available; frame-generation safeguards still apply.</w:t>
+        <w:br/>
+        <w:t>Sharpening and bloom strength range from 0 to 3. Expand Bloom details for Highlight threshold (0–2; default 0.65), Threshold softness (0–1; default 0.5), Glow radius (0.25–3; default 1), Scatter (0–1; default 0.7), and Glow saturation (0–2; default 1). These controls follow the bloom enable switch; each Reset restores only its value.</w:t>
+      </w:r>
+    </w:p>
+    <w:p>
+      <w:pPr>
+        <w:pStyle w:val="Heading2"/>
+      </w:pPr>
+      <w:r>
+        <w:rPr>
+          <w:color w:val="000000"/>
+        </w:rPr>
+        <w:t>Using PNG LUTs</w:t>
+      </w:r>
+    </w:p>
+    <w:p>
+      <w:pPr>
+        <w:spacing w:after="140"/>
+      </w:pPr>
+      <w:r>
+        <w:t>Put PNG lookup tables directly in the lut folder beside DXL.exe. Select a file in Color Grading, enable LUT and set its strength.</w:t>
+      </w:r>
+    </w:p>
+    <w:p>
+      <w:pPr>
+        <w:spacing w:after="140"/>
+      </w:pPr>
+      <w:r>
+        <w:t>Neutral-16.png is a neutral template with no color change. Apply color-only edits in an image editor, then save under a new filename. Do not resize, crop, rotate or blur it. A normal photograph is not a LUT.</w:t>
+      </w:r>
+    </w:p>
+    <w:p>
+      <w:pPr>
+        <w:spacing w:after="140"/>
+      </w:pPr>
+      <w:r>
+        <w:t>The template uses sixteen 16 by 16 tiles. See lut/README.md for supported layouts. Updates preserve added files; bundled examples may be replaced, so save edited copies under new names.</w:t>
+      </w:r>
+    </w:p>
+    <w:p>
+      <w:pPr>
+        <w:spacing w:after="140"/>
+      </w:pPr>
+      <w:r>
+        <w:t>Open Extras &gt; Post-processing. Add native ReShade .fx files with their .fxh includes and textures, keeping relative folders, then reload in Color Grading &gt; Custom FX. Techniques have separate switches; parameters save per game and reset changes values only. DXL FX examples still work. DXL effects run first, then ReShade files alphabetically. Sources stay intact. Multi-pass effects and external textures work; game depth, motion vectors, add-ons and keyboard/mouse source uniforms are not provided. See post-processing/README.md for details.</w:t>
+      </w:r>
+    </w:p>
     <w:sectPr>
       <w:footerReference w:type="default" r:id="rId9"/>
       <w:pgSz w:w="11909" w:h="16834"/>
@@ -954,7 +1061,7 @@
       <w:rPr>
         <w:sz w:val="16"/>
       </w:rPr>
-      <w:t xml:space="preserve">DXL 0.5  |  </w:t>
+      <w:t xml:space="preserve">DXL 0.6  |  </w:t>
     </w:r>
     <w:fldSimple w:instr="PAGE"/>
   </w:p>

</xml_diff>